<commit_message>
Add request logging and CSV export for activity logs
Introduce a RequestLoggingInterceptor to record page views, form submits and API calls (excluding static assets) and register it in WebConfig. Extend AdminLog with resource and userAgent fields and add a logWithDetails() service method. Add repository query for filtered export and AdminLogService.getAllLogsForExport(). Add /admin/activity-logs/export endpoint to AdminController to stream UTF-8 CSV exports. Update activity_logs.html to include export button, new traffic/admin action groups, and show IP, resource and user agent columns with layout/styling tweaks. Also minor WebConfig formatting/timezone cleanup.
</commit_message>
<xml_diff>
--- a/shopping-cart-spring-boot-main/uploads/academic/4/doc_6.docx
+++ b/shopping-cart-spring-boot-main/uploads/academic/4/doc_6.docx
@@ -3822,7 +3822,7 @@
                                 <w:sz w:val="24"/>
                                 <w:szCs w:val="24"/>
                               </w:rPr>
-                              <w:t>wdsswwrd</w:t>
+                              <w:t>fwdsswwrd</w:t>
                             </w:r>
                             <w:r>
                               <w:rPr>
@@ -3918,7 +3918,7 @@
                                 <w:sz w:val="24"/>
                                 <w:szCs w:val="24"/>
                               </w:rPr>
-                              <w:t>iidddwswsswrd</w:t>
+                              <w:t>fiidddwswsswrd</w:t>
                             </w:r>
                             <w:r>
                               <w:rPr>
@@ -4014,7 +4014,7 @@
                                 <w:sz w:val="24"/>
                                 <w:szCs w:val="24"/>
                               </w:rPr>
-                              <w:t>qsqqsqsqsqdddrd</w:t>
+                              <w:t>fqsqqsqsqsqdddrd</w:t>
                             </w:r>
                             <w:r>
                               <w:rPr>
@@ -4115,7 +4115,7 @@
                           <w:sz w:val="24"/>
                           <w:szCs w:val="24"/>
                         </w:rPr>
-                        <w:t>wdsswwrd</w:t>
+                        <w:t>fwdsswwrd</w:t>
                       </w:r>
                       <w:r>
                         <w:rPr>
@@ -4211,7 +4211,7 @@
                           <w:sz w:val="24"/>
                           <w:szCs w:val="24"/>
                         </w:rPr>
-                        <w:t>iidddwswsswrd</w:t>
+                        <w:t>fiidddwswsswrd</w:t>
                       </w:r>
                       <w:r>
                         <w:rPr>
@@ -4307,7 +4307,7 @@
                           <w:sz w:val="24"/>
                           <w:szCs w:val="24"/>
                         </w:rPr>
-                        <w:t>qsqqsqsqsqdddrd</w:t>
+                        <w:t>fqsqqsqsqsqdddrd</w:t>
                       </w:r>
                       <w:r>
                         <w:rPr>

</xml_diff>